<commit_message>
feat(ui): enrichit les statistiques et ajuste l'affichage
Ajoute deux analyses chronologiques ciblées et leurs libellés i18n.
Ajuste le style d'un lien, le CSP connect-src blob et la documentation associée.
</commit_message>
<xml_diff>
--- a/Passation-technique-STAVNET.docx
+++ b/Passation-technique-STAVNET.docx
@@ -1228,6 +1228,62 @@
           </w:p>
         </w:tc>
       </w:tr>
+      <w:tr>
+        <w:tc>
+          <w:tcPr>
+            <w:tcW w:type="dxa" w:w="3120"/>
+            <w:tcMar>
+              <w:top w:w="110" w:type="dxa"/>
+              <w:start w:w="120" w:type="dxa"/>
+              <w:bottom w:w="110" w:type="dxa"/>
+              <w:end w:w="120" w:type="dxa"/>
+            </w:tcMar>
+            <w:vAlign w:val="center"/>
+          </w:tcPr>
+          <w:p>
+            <w:r/>
+            <w:r>
+              <w:t>Tableau de bord admin du site</w:t>
+            </w:r>
+          </w:p>
+        </w:tc>
+        <w:tc>
+          <w:tcPr>
+            <w:tcW w:type="dxa" w:w="3120"/>
+            <w:tcMar>
+              <w:top w:w="110" w:type="dxa"/>
+              <w:start w:w="120" w:type="dxa"/>
+              <w:bottom w:w="110" w:type="dxa"/>
+              <w:end w:w="120" w:type="dxa"/>
+            </w:tcMar>
+            <w:vAlign w:val="center"/>
+          </w:tcPr>
+          <w:p>
+            <w:r/>
+            <w:r>
+              <w:t>Aucun identifiant</w:t>
+            </w:r>
+          </w:p>
+        </w:tc>
+        <w:tc>
+          <w:tcPr>
+            <w:tcW w:type="dxa" w:w="3120"/>
+            <w:tcMar>
+              <w:top w:w="110" w:type="dxa"/>
+              <w:start w:w="120" w:type="dxa"/>
+              <w:bottom w:w="110" w:type="dxa"/>
+              <w:end w:w="120" w:type="dxa"/>
+            </w:tcMar>
+            <w:vAlign w:val="center"/>
+          </w:tcPr>
+          <w:p>
+            <w:r/>
+            <w:r>
+              <w:t>StavNet92</w:t>
+            </w:r>
+          </w:p>
+        </w:tc>
+      </w:tr>
     </w:tbl>
     <w:p/>
     <w:p>

</xml_diff>